<commit_message>
LA MARQUE 3부: rename patient Garnier to Bertin (clash with Sylvie Garnier)
Co-Authored-By: Claude Opus 5.5 <noreply@anthropic.com>
Claude-Session: https://claude.ai/code/session_01N4vhCLeYxrjvGnDxQBD9Cq
</commit_message>
<xml_diff>
--- a/la-marque/대본/3부/04화_La_demonstration.docx
+++ b/la-marque/대본/3부/04화_La_demonstration.docx
@@ -65,7 +65,7 @@
         <w:t xml:space="preserve"> </w:t>
       </w:r>
       <w:r>
-        <w:t xml:space="preserve">- 등장인물: Clémence, Bastien, Inès, Jihoon(전화), Dr Hélène Fabre, Mme Odile Garnier(61, 파브르의 환자), Dr Olivier Dumas</w:t>
+        <w:t xml:space="preserve">- 등장인물: Clémence, Bastien, Inès, Jihoon(전화), Dr Hélène Fabre, Mme Odile Bertin(61, 파브르의 환자), Dr Olivier Dumas</w:t>
       </w:r>
       <w:r>
         <w:t xml:space="preserve"> </w:t>
@@ -226,7 +226,7 @@
           <w:bCs/>
           <w:b/>
         </w:rPr>
-        <w:t xml:space="preserve">가르니에 부인(61, 우체국 창구 30년, 파브르 환자 8년): 파브르가 직접 고름(위원회 규칙</w:t>
+        <w:t xml:space="preserve">베르탱 부인(61, 우체국 창구 30년, 파브르 환자 8년): 파브르가 직접 고름(위원회 규칙</w:t>
       </w:r>
       <w:r>
         <w:rPr>
@@ -575,7 +575,7 @@
           <w:bCs/>
           <w:b/>
         </w:rPr>
-        <w:t xml:space="preserve">→ 가르니에</w:t>
+        <w:t xml:space="preserve">→ 베르탱</w:t>
       </w:r>
       <w:r>
         <w:rPr>
@@ -941,7 +941,7 @@
           <w:bCs/>
           <w:b/>
         </w:rPr>
-        <w:t xml:space="preserve">. 가르니에</w:t>
+        <w:t xml:space="preserve">. 베르탱</w:t>
       </w:r>
       <w:r>
         <w:rPr>
@@ -1147,15 +1147,15 @@
         <w:pStyle w:val="FirstParagraph"/>
       </w:pPr>
       <w:r>
-        <w:t xml:space="preserve">FABRE: Bonjour à tous. Je vous présente madame Garnier, ma patiente depuis huit ans. Elle a accepté de venir aujourd’hui, et je tiens à le dire tout de suite : c’est moi qui l’ai choisie, personne d’autre, et sans rien vous demander.</w:t>
-      </w:r>
-    </w:p>
-    <w:p>
-      <w:pPr>
-        <w:pStyle w:val="BodyText"/>
-      </w:pPr>
-      <w:r>
-        <w:t xml:space="preserve">GARNIER: Bonjour. Soixante et un ans, retraitée de la poste, et première fois devant trois cents médecins.</w:t>
+        <w:t xml:space="preserve">FABRE: Bonjour à tous. Je vous présente madame Bertin, ma patiente depuis huit ans. Elle a accepté de venir aujourd’hui, et je tiens à le dire tout de suite : c’est moi qui l’ai choisie, personne d’autre, et sans rien vous demander.</w:t>
+      </w:r>
+    </w:p>
+    <w:p>
+      <w:pPr>
+        <w:pStyle w:val="BodyText"/>
+      </w:pPr>
+      <w:r>
+        <w:t xml:space="preserve">BERTIN: Bonjour. Soixante et un ans, retraitée de la poste, et première fois devant trois cents médecins.</w:t>
       </w:r>
     </w:p>
     <w:p>
@@ -1187,7 +1187,7 @@
         <w:pStyle w:val="BodyText"/>
       </w:pPr>
       <w:r>
-        <w:t xml:space="preserve">GARNIER: Deux formulaires. J’ai tout lu. Ma fille est avocate, elle a tout relu.</w:t>
+        <w:t xml:space="preserve">BERTIN: Deux formulaires. J’ai tout lu. Ma fille est avocate, elle a tout relu.</w:t>
       </w:r>
     </w:p>
     <w:p>
@@ -1227,7 +1227,7 @@
         <w:pStyle w:val="BodyText"/>
       </w:pPr>
       <w:r>
-        <w:t xml:space="preserve">FABRE: Je ne vais pas injecter madame Garnier pour la dissoudre ensuite. Ce serait absurde, et contraire à l’éthique.</w:t>
+        <w:t xml:space="preserve">FABRE: Je ne vais pas injecter madame Bertin pour la dissoudre ensuite. Ce serait absurde, et contraire à l’éthique.</w:t>
       </w:r>
     </w:p>
     <w:p>
@@ -1339,7 +1339,7 @@
         <w:pStyle w:val="BodyText"/>
       </w:pPr>
       <w:r>
-        <w:t xml:space="preserve">GARNIER: Excusez-moi. Moi, je dois faire quoi pendant les dix minutes ? Sourire ?</w:t>
+        <w:t xml:space="preserve">BERTIN: Excusez-moi. Moi, je dois faire quoi pendant les dix minutes ? Sourire ?</w:t>
       </w:r>
     </w:p>
     <w:p>
@@ -1355,7 +1355,7 @@
         <w:pStyle w:val="BodyText"/>
       </w:pPr>
       <w:r>
-        <w:t xml:space="preserve">GARNIER: J’ai travaillé trente ans au guichet. Je sais dire quand quelque chose ne va pas.</w:t>
+        <w:t xml:space="preserve">BERTIN: J’ai travaillé trente ans au guichet. Je sais dire quand quelque chose ne va pas.</w:t>
       </w:r>
     </w:p>
     <w:p>
@@ -1469,15 +1469,15 @@
         <w:pStyle w:val="BodyText"/>
       </w:pPr>
       <w:r>
-        <w:t xml:space="preserve">FABRE: Madame Garnier, ma patiente. Objectif : un peu de soutien aux pommettes. Rien de plus.</w:t>
-      </w:r>
-    </w:p>
-    <w:p>
-      <w:pPr>
-        <w:pStyle w:val="BodyText"/>
-      </w:pPr>
-      <w:r>
-        <w:t xml:space="preserve">GARNIER: Mon visage me va très bien. Je veux juste avoir l’air moins fatiguée que mes petits-enfants.</w:t>
+        <w:t xml:space="preserve">FABRE: Madame Bertin, ma patiente. Objectif : un peu de soutien aux pommettes. Rien de plus.</w:t>
+      </w:r>
+    </w:p>
+    <w:p>
+      <w:pPr>
+        <w:pStyle w:val="BodyText"/>
+      </w:pPr>
+      <w:r>
+        <w:t xml:space="preserve">BERTIN: Mon visage me va très bien. Je veux juste avoir l’air moins fatiguée que mes petits-enfants.</w:t>
       </w:r>
     </w:p>
     <w:p>
@@ -1509,7 +1509,7 @@
         <w:pStyle w:val="BodyText"/>
       </w:pPr>
       <w:r>
-        <w:t xml:space="preserve">CLEMENCE: La coupelle, oui. Madame Garnier, non. Fabre l’a dit au début.</w:t>
+        <w:t xml:space="preserve">CLEMENCE: La coupelle, oui. Madame Bertin, non. Fabre l’a dit au début.</w:t>
       </w:r>
     </w:p>
     <w:p>
@@ -1573,15 +1573,15 @@
         <w:pStyle w:val="BodyText"/>
       </w:pPr>
       <w:r>
-        <w:t xml:space="preserve">FABRE: Côté gauche terminé. Madame Garnier, comment ça va ?</w:t>
-      </w:r>
-    </w:p>
-    <w:p>
-      <w:pPr>
-        <w:pStyle w:val="BodyText"/>
-      </w:pPr>
-      <w:r>
-        <w:t xml:space="preserve">GARNIER: Ça pique un peu. Comme une prise de sang. Pas de quoi déranger trois cents personnes.</w:t>
+        <w:t xml:space="preserve">FABRE: Côté gauche terminé. Madame Bertin, comment ça va ?</w:t>
+      </w:r>
+    </w:p>
+    <w:p>
+      <w:pPr>
+        <w:pStyle w:val="BodyText"/>
+      </w:pPr>
+      <w:r>
+        <w:t xml:space="preserve">BERTIN: Ça pique un peu. Comme une prise de sang. Pas de quoi déranger trois cents personnes.</w:t>
       </w:r>
     </w:p>
     <w:p>
@@ -1703,7 +1703,7 @@
         <w:pStyle w:val="BodyText"/>
       </w:pPr>
       <w:r>
-        <w:t xml:space="preserve">GARNIER: Je peux parler ? C’est mon visage, après tout, ça m’intéresse aussi.</w:t>
+        <w:t xml:space="preserve">BERTIN: Je peux parler ? C’est mon visage, après tout, ça m’intéresse aussi.</w:t>
       </w:r>
     </w:p>
     <w:p>
@@ -1719,7 +1719,7 @@
         <w:pStyle w:val="BodyText"/>
       </w:pPr>
       <w:r>
-        <w:t xml:space="preserve">GARNIER: Si un jour je n’aime pas le résultat, on peut l’enlever, oui ou non ?</w:t>
+        <w:t xml:space="preserve">BERTIN: Si un jour je n’aime pas le résultat, on peut l’enlever, oui ou non ?</w:t>
       </w:r>
     </w:p>
     <w:p>
@@ -1807,7 +1807,7 @@
         <w:pStyle w:val="BodyText"/>
       </w:pPr>
       <w:r>
-        <w:t xml:space="preserve">GARNIER: Donc, si je comprends bien, c’est réversible, mais il faut être patient. Comme mon mari.</w:t>
+        <w:t xml:space="preserve">BERTIN: Donc, si je comprends bien, c’est réversible, mais il faut être patient. Comme mon mari.</w:t>
       </w:r>
     </w:p>
     <w:p>
@@ -1863,23 +1863,23 @@
         <w:pStyle w:val="BodyText"/>
       </w:pPr>
       <w:r>
-        <w:t xml:space="preserve">INES: Pour le chiffre, et pour madame Garnier. Regarde, elle salue comme une actrice.</w:t>
-      </w:r>
-    </w:p>
-    <w:p>
-      <w:pPr>
-        <w:pStyle w:val="BodyText"/>
-      </w:pPr>
-      <w:r>
-        <w:t xml:space="preserve">GARNIER: Trente ans au guichet, et c’est à soixante et un ans qu’on m’applaudit. Merci, la science.</w:t>
-      </w:r>
-    </w:p>
-    <w:p>
-      <w:pPr>
-        <w:pStyle w:val="BodyText"/>
-      </w:pPr>
-      <w:r>
-        <w:t xml:space="preserve">FABRE: Merci, madame Garnier. Et merci au chronomètre.</w:t>
+        <w:t xml:space="preserve">INES: Pour le chiffre, et pour madame Bertin. Regarde, elle salue comme une actrice.</w:t>
+      </w:r>
+    </w:p>
+    <w:p>
+      <w:pPr>
+        <w:pStyle w:val="BodyText"/>
+      </w:pPr>
+      <w:r>
+        <w:t xml:space="preserve">BERTIN: Trente ans au guichet, et c’est à soixante et un ans qu’on m’applaudit. Merci, la science.</w:t>
+      </w:r>
+    </w:p>
+    <w:p>
+      <w:pPr>
+        <w:pStyle w:val="BodyText"/>
+      </w:pPr>
+      <w:r>
+        <w:t xml:space="preserve">FABRE: Merci, madame Bertin. Et merci au chronomètre.</w:t>
       </w:r>
     </w:p>
     <w:bookmarkEnd w:id="24"/>
@@ -1985,7 +1985,7 @@
         <w:pStyle w:val="BodyText"/>
       </w:pPr>
       <w:r>
-        <w:t xml:space="preserve">INES: Madame Garnier m’a demandé si elle pouvait garder le badge « intervenante ». Je lui en ai donné deux.</w:t>
+        <w:t xml:space="preserve">INES: Madame Bertin m’a demandé si elle pouvait garder le badge « intervenante ». Je lui en ai donné deux.</w:t>
       </w:r>
     </w:p>
     <w:p>
@@ -3776,15 +3776,15 @@
         <w:pStyle w:val="FirstParagraph"/>
       </w:pPr>
       <w:r>
-        <w:t xml:space="preserve">파브르: 모두 안녕하세요. 8년째 제 환자인 가르니에 부인을 소개합니다. 오늘 와 주시기로 했고, 바로 말해 두고 싶어요. 이분을 고른 건 저예요. 다른 누구도 아니고, 여러분에게 아무것도 묻지 않고요.</w:t>
-      </w:r>
-    </w:p>
-    <w:p>
-      <w:pPr>
-        <w:pStyle w:val="BodyText"/>
-      </w:pPr>
-      <w:r>
-        <w:t xml:space="preserve">가르니에: 안녕하세요. 예순한 살, 우체국 퇴직, 그리고 의사 3백 명 앞은 처음이에요.</w:t>
+        <w:t xml:space="preserve">파브르: 모두 안녕하세요. 8년째 제 환자인 베르탱 부인을 소개합니다. 오늘 와 주시기로 했고, 바로 말해 두고 싶어요. 이분을 고른 건 저예요. 다른 누구도 아니고, 여러분에게 아무것도 묻지 않고요.</w:t>
+      </w:r>
+    </w:p>
+    <w:p>
+      <w:pPr>
+        <w:pStyle w:val="BodyText"/>
+      </w:pPr>
+      <w:r>
+        <w:t xml:space="preserve">베르탱: 안녕하세요. 예순한 살, 우체국 퇴직, 그리고 의사 3백 명 앞은 처음이에요.</w:t>
       </w:r>
     </w:p>
     <w:p>
@@ -3816,7 +3816,7 @@
         <w:pStyle w:val="BodyText"/>
       </w:pPr>
       <w:r>
-        <w:t xml:space="preserve">가르니에: 서류 두 장. 다 읽었어요. 딸이 변호사라 다시 다 읽었고요.</w:t>
+        <w:t xml:space="preserve">베르탱: 서류 두 장. 다 읽었어요. 딸이 변호사라 다시 다 읽었고요.</w:t>
       </w:r>
     </w:p>
     <w:p>
@@ -3856,7 +3856,7 @@
         <w:pStyle w:val="BodyText"/>
       </w:pPr>
       <w:r>
-        <w:t xml:space="preserve">파브르: 가르니에 부인께 주사했다가 다시 녹이지는 않을 거예요. 말도 안 되고, 윤리에도 어긋나요.</w:t>
+        <w:t xml:space="preserve">파브르: 베르탱 부인께 주사했다가 다시 녹이지는 않을 거예요. 말도 안 되고, 윤리에도 어긋나요.</w:t>
       </w:r>
     </w:p>
     <w:p>
@@ -3968,7 +3968,7 @@
         <w:pStyle w:val="BodyText"/>
       </w:pPr>
       <w:r>
-        <w:t xml:space="preserve">가르니에: 실례지만요. 저는 그 10분 동안 뭘 하면 돼요? 웃어요?</w:t>
+        <w:t xml:space="preserve">베르탱: 실례지만요. 저는 그 10분 동안 뭘 하면 돼요? 웃어요?</w:t>
       </w:r>
     </w:p>
     <w:p>
@@ -3984,7 +3984,7 @@
         <w:pStyle w:val="BodyText"/>
       </w:pPr>
       <w:r>
-        <w:t xml:space="preserve">가르니에: 30년을 창구에서 일했어요. 뭔가 잘못되면 말할 줄 알아요.</w:t>
+        <w:t xml:space="preserve">베르탱: 30년을 창구에서 일했어요. 뭔가 잘못되면 말할 줄 알아요.</w:t>
       </w:r>
     </w:p>
     <w:p>
@@ -4098,15 +4098,15 @@
         <w:pStyle w:val="BodyText"/>
       </w:pPr>
       <w:r>
-        <w:t xml:space="preserve">파브르: 제 환자 가르니에 부인입니다. 목표: 광대에 약간의 지지. 그 이상은 없습니다.</w:t>
-      </w:r>
-    </w:p>
-    <w:p>
-      <w:pPr>
-        <w:pStyle w:val="BodyText"/>
-      </w:pPr>
-      <w:r>
-        <w:t xml:space="preserve">가르니에: 제 얼굴은 아주 마음에 들어요. 그냥 손주들보다 덜 피곤해 보이고 싶을 뿐이에요.</w:t>
+        <w:t xml:space="preserve">파브르: 제 환자 베르탱 부인입니다. 목표: 광대에 약간의 지지. 그 이상은 없습니다.</w:t>
+      </w:r>
+    </w:p>
+    <w:p>
+      <w:pPr>
+        <w:pStyle w:val="BodyText"/>
+      </w:pPr>
+      <w:r>
+        <w:t xml:space="preserve">베르탱: 제 얼굴은 아주 마음에 들어요. 그냥 손주들보다 덜 피곤해 보이고 싶을 뿐이에요.</w:t>
       </w:r>
     </w:p>
     <w:p>
@@ -4138,7 +4138,7 @@
         <w:pStyle w:val="BodyText"/>
       </w:pPr>
       <w:r>
-        <w:t xml:space="preserve">클레망스: 접시는 돼. 가르니에 부인은 안 돼. 파브르 선생님이 처음에 말했어.</w:t>
+        <w:t xml:space="preserve">클레망스: 접시는 돼. 베르탱 부인은 안 돼. 파브르 선생님이 처음에 말했어.</w:t>
       </w:r>
     </w:p>
     <w:p>
@@ -4202,15 +4202,15 @@
         <w:pStyle w:val="BodyText"/>
       </w:pPr>
       <w:r>
-        <w:t xml:space="preserve">파브르: 왼쪽 끝났습니다. 가르니에 부인, 괜찮으세요?</w:t>
-      </w:r>
-    </w:p>
-    <w:p>
-      <w:pPr>
-        <w:pStyle w:val="BodyText"/>
-      </w:pPr>
-      <w:r>
-        <w:t xml:space="preserve">가르니에: 좀 따끔해요. 채혈할 때처럼. 3백 명을 방해할 정도는 아니에요.</w:t>
+        <w:t xml:space="preserve">파브르: 왼쪽 끝났습니다. 베르탱 부인, 괜찮으세요?</w:t>
+      </w:r>
+    </w:p>
+    <w:p>
+      <w:pPr>
+        <w:pStyle w:val="BodyText"/>
+      </w:pPr>
+      <w:r>
+        <w:t xml:space="preserve">베르탱: 좀 따끔해요. 채혈할 때처럼. 3백 명을 방해할 정도는 아니에요.</w:t>
       </w:r>
     </w:p>
     <w:p>
@@ -4332,7 +4332,7 @@
         <w:pStyle w:val="BodyText"/>
       </w:pPr>
       <w:r>
-        <w:t xml:space="preserve">가르니에: 제가 말해도 될까요? 어쨌든 제 얼굴이니까, 저도 궁금해요.</w:t>
+        <w:t xml:space="preserve">베르탱: 제가 말해도 될까요? 어쨌든 제 얼굴이니까, 저도 궁금해요.</w:t>
       </w:r>
     </w:p>
     <w:p>
@@ -4348,7 +4348,7 @@
         <w:pStyle w:val="BodyText"/>
       </w:pPr>
       <w:r>
-        <w:t xml:space="preserve">가르니에: 언젠가 결과가 마음에 안 들면, 뺄 수 있어요, 없어요?</w:t>
+        <w:t xml:space="preserve">베르탱: 언젠가 결과가 마음에 안 들면, 뺄 수 있어요, 없어요?</w:t>
       </w:r>
     </w:p>
     <w:p>
@@ -4436,7 +4436,7 @@
         <w:pStyle w:val="BodyText"/>
       </w:pPr>
       <w:r>
-        <w:t xml:space="preserve">가르니에: 그러니까, 제가 이해한 게 맞으면, 되돌릴 수 있지만 참을성이 필요하다는 거네요. 우리 남편처럼.</w:t>
+        <w:t xml:space="preserve">베르탱: 그러니까, 제가 이해한 게 맞으면, 되돌릴 수 있지만 참을성이 필요하다는 거네요. 우리 남편처럼.</w:t>
       </w:r>
     </w:p>
     <w:p>
@@ -4492,23 +4492,23 @@
         <w:pStyle w:val="BodyText"/>
       </w:pPr>
       <w:r>
-        <w:t xml:space="preserve">이네스: 숫자, 그리고 가르니에 부인. 봐, 배우처럼 인사하셔.</w:t>
-      </w:r>
-    </w:p>
-    <w:p>
-      <w:pPr>
-        <w:pStyle w:val="BodyText"/>
-      </w:pPr>
-      <w:r>
-        <w:t xml:space="preserve">가르니에: 30년 창구 일, 그런데 예순한 살에 박수를 받네요. 고마워요, 과학.</w:t>
-      </w:r>
-    </w:p>
-    <w:p>
-      <w:pPr>
-        <w:pStyle w:val="BodyText"/>
-      </w:pPr>
-      <w:r>
-        <w:t xml:space="preserve">파브르: 고마워요, 가르니에 부인. 그리고 스톱워치에게도.</w:t>
+        <w:t xml:space="preserve">이네스: 숫자, 그리고 베르탱 부인. 봐, 배우처럼 인사하셔.</w:t>
+      </w:r>
+    </w:p>
+    <w:p>
+      <w:pPr>
+        <w:pStyle w:val="BodyText"/>
+      </w:pPr>
+      <w:r>
+        <w:t xml:space="preserve">베르탱: 30년 창구 일, 그런데 예순한 살에 박수를 받네요. 고마워요, 과학.</w:t>
+      </w:r>
+    </w:p>
+    <w:p>
+      <w:pPr>
+        <w:pStyle w:val="BodyText"/>
+      </w:pPr>
+      <w:r>
+        <w:t xml:space="preserve">파브르: 고마워요, 베르탱 부인. 그리고 스톱워치에게도.</w:t>
       </w:r>
     </w:p>
     <w:bookmarkEnd w:id="36"/>
@@ -4614,7 +4614,7 @@
         <w:pStyle w:val="BodyText"/>
       </w:pPr>
       <w:r>
-        <w:t xml:space="preserve">이네스: 가르니에 부인이 「발표자」 배지를 가져가도 되냐고 물으셨어. 두 개 드렸어.</w:t>
+        <w:t xml:space="preserve">이네스: 베르탱 부인이 「발표자」 배지를 가져가도 되냐고 물으셨어. 두 개 드렸어.</w:t>
       </w:r>
     </w:p>
     <w:p>

</xml_diff>